<commit_message>
Phase 18.6: Refresh FRS documentation and user manuals
</commit_message>
<xml_diff>
--- a/Docs/User_Manuals/FormRequest_Documentation/1_System_Overview.docx
+++ b/Docs/User_Manuals/FormRequest_Documentation/1_System_Overview.docx
@@ -12,12 +12,12 @@
           <w:color w:val="1F2937"/>
           <w:sz w:val="40"/>
         </w:rPr>
-        <w:t>FormRequest System — User Guide and Documentation</w:t>
+        <w:t>FormRequest System: User Guide and Documentation</w:t>
       </w:r>
     </w:p>
     <w:p>
       <w:r>
-        <w:t>An internal web application that digitizes the entire gate pass process — from request, approval, and printing, to monitoring entry and exit at the gate. This guide is written for every user.</w:t>
+        <w:t>An internal web application that digitizes the entire gate pass process, from request, approval, and printing, to monitoring entry and exit at the gate. This guide is written for every user.</w:t>
       </w:r>
     </w:p>
     <w:p>
@@ -133,7 +133,7 @@
           </w:tcPr>
           <w:p>
             <w:r>
-              <w:t>Includes QR Time Out / Time In. May include a company vehicle.</w:t>
+              <w:t>Includes QR Time Out / Time In. May include associates and a company vehicle.</w:t>
             </w:r>
           </w:p>
         </w:tc>
@@ -174,7 +174,17 @@
     <w:p/>
     <w:p>
       <w:r>
-        <w:t>Trip type (when a company vehicle is required): the requester selects Hatid at Sundo (drop-off and pick-up), Hatid lang (drop-off only), or Sundo lang (pick-up only). The requester's chosen trip type is final and is locked at assignment.</w:t>
+        <w:t>Trip type (when a company vehicle is required): the requester selects Hatid at Sundo (drop off and pick up), Hatid lang (drop off only), or Sundo lang (pick up only). The requester's chosen trip type is final and is locked at assignment.</w:t>
+      </w:r>
+    </w:p>
+    <w:p>
+      <w:r>
+        <w:t>Who the request is for: the Associates section asks who a Person Gate Pass covers. Kasama ako (the default) means the requester goes out too. Para sa iba lang means the requester stays inside and the pass covers only the listed associates; at least one associate is then required.</w:t>
+      </w:r>
+    </w:p>
+    <w:p>
+      <w:r>
+        <w:t>Companions: each companion row has an Employee checkbox. When it is ticked, the companion is picked from the employee directory and the suggestion list shows up to six matches. When it is not ticked, the companion is an outside person such as a visitor or an OJT, whose name is typed directly and saved exactly as typed. Pressing Enter on a finished row adds and focuses the next companion row; the Add companion button does the same.</w:t>
       </w:r>
     </w:p>
     <w:p>
@@ -291,7 +301,7 @@
           </w:tcPr>
           <w:p>
             <w:r>
-              <w:t>Executive approval when required.</w:t>
+              <w:t>Final approver of a printed company vehicle form, by physical signature on paper. There is no digital President approval step.</w:t>
             </w:r>
           </w:p>
         </w:tc>
@@ -313,7 +323,7 @@
           </w:tcPr>
           <w:p>
             <w:r>
-              <w:t>Final noting; assigns the vehicle and schedule.</w:t>
+              <w:t>HRAD assigns the vehicle, driver, and schedule; PAS performs the final digital noting. The HRAD vehicle assigners are Joy (GA120), Roxanne Encinada (GA139), and Myla Mae Abarquez (GA412).</w:t>
             </w:r>
           </w:p>
         </w:tc>
@@ -383,9 +393,15 @@
           <w:rFonts w:ascii="Consolas" w:hAnsi="Consolas"/>
           <w:sz w:val="18"/>
         </w:rPr>
-        <w:t>Requester -&gt; Immediate Superior -&gt; HRAD Assignment -&gt; President -&gt; PAS Noting -&gt; APPROVED</w:t>
+        <w:t>1. The requester submits the request.</w:t>
         <w:br/>
-        <w:t>(HRAD applies when a company vehicle is required; President when required; PAS is the final step.)</w:t>
+        <w:t>2. The Immediate Superior approves. This step is skipped when the requester is an immediate superior.</w:t>
+        <w:br/>
+        <w:t>3. HRAD Assignment follows, for company vehicle requests only.</w:t>
+        <w:br/>
+        <w:t>4. PAS Noting is the final digital step; the request then becomes APPROVED and the QR code is issued.</w:t>
+        <w:br/>
+        <w:t>5. For a company vehicle, the President signs the printed form by hand as the final approval. The PRESIDENT line carries the printed name TOMOAKI MAEKAWA.</w:t>
       </w:r>
     </w:p>
     <w:p>
@@ -408,7 +424,7 @@
     </w:p>
     <w:p>
       <w:r>
-        <w:t>Three components communicate: the BROWSER (what you see and interact with), the API SERVER (the logic layer, where decisions are made and QR codes are generated), and the DATABASE (where records are stored). The flow is browser -&gt; API -&gt; database -&gt; back to the browser.</w:t>
+        <w:t>Three components communicate: the BROWSER (what you see and interact with), the API SERVER (the logic layer, where decisions are made and QR codes are generated), and the DATABASE (where records are stored). Every action flows from the browser to the API to the database and back to the browser.</w:t>
       </w:r>
     </w:p>
     <w:p>
@@ -417,11 +433,11 @@
           <w:rFonts w:ascii="Consolas" w:hAnsi="Consolas"/>
           <w:sz w:val="18"/>
         </w:rPr>
-        <w:t xml:space="preserve">  BROWSER            API SERVER           DATABASE</w:t>
+        <w:t>BROWSER (front-end UI, index.html)</w:t>
         <w:br/>
-        <w:t xml:space="preserve">  (front-end UI)  &lt;-&gt;  (logic layer)  &lt;-&gt;  (storage)</w:t>
+        <w:t>connects over HTTPS to the API SERVER (logic layer, ASP.NET Core 8),</w:t>
         <w:br/>
-        <w:t xml:space="preserve">  index.html   HTTPS  ASP.NET Core 8  SQL  MariaDB / XAMPP</w:t>
+        <w:t>which uses SQL to reach the DATABASE (storage, MariaDB / XAMPP)</w:t>
       </w:r>
     </w:p>
     <w:p>
@@ -431,7 +447,7 @@
           <w:color w:val="555F6B"/>
           <w:sz w:val="20"/>
         </w:rPr>
-        <w:t>Note: For IT: Front end = Vanilla JS + Tailwind. Back end = ASP.NET Core 8 (C#), Dapper, stored procedures. Database = MariaDB via XAMPP. Authentication = Employee ID + password -&gt; JWT. Roles/permissions are stored in the database. Approval steps: SUPERIOR -&gt; HRAD_ASSIGN -&gt; PRESIDENT -&gt; PAS.</w:t>
+        <w:t>Note: For IT: Front end = Vanilla JS + Tailwind. Back end = ASP.NET Core 8 (C#), Dapper, stored procedures. Database = MariaDB via XAMPP. Authentication = case-insensitive name or Employee ID plus password, returning a JWT. Roles and permissions are stored in the database. Digital approval steps: SUPERIOR, then HRAD_ASSIGN, then PAS. The President's approval is a physical signature on the printed company vehicle form.</w:t>
       </w:r>
     </w:p>
     <w:sectPr>

</xml_diff>